<commit_message>
fixed typo in help desk API chapter
</commit_message>
<xml_diff>
--- a/docs/Fleet Admin REST API - Help Desk.docx
+++ b/docs/Fleet Admin REST API - Help Desk.docx
@@ -9,8 +9,8 @@
           <w:color w:val="auto"/>
         </w:rPr>
       </w:pPr>
-      <w:bookmarkStart w:id="0" w:name="_Toc491686596"/>
-      <w:bookmarkStart w:id="1" w:name="_Toc90040711"/>
+      <w:bookmarkStart w:id="0" w:name="_Toc90040711"/>
+      <w:bookmarkStart w:id="1" w:name="_Toc491686596"/>
       <w:r>
         <w:rPr>
           <w:color w:val="auto"/>
@@ -23,7 +23,7 @@
         </w:rPr>
         <w:t>Services</w:t>
       </w:r>
-      <w:bookmarkEnd w:id="1"/>
+      <w:bookmarkEnd w:id="0"/>
     </w:p>
     <w:p>
       <w:pPr>
@@ -39,13 +39,19 @@
         <w:t xml:space="preserve"> </w:t>
       </w:r>
       <w:r>
-        <w:t>chatper</w:t>
+        <w:t>chapter</w:t>
       </w:r>
       <w:r>
         <w:t xml:space="preserve"> </w:t>
       </w:r>
       <w:r>
-        <w:t xml:space="preserve">defines Helpdesk Services. The API URI </w:t>
+        <w:t xml:space="preserve">defines </w:t>
+      </w:r>
+      <w:r>
+        <w:t>the Help Desk s</w:t>
+      </w:r>
+      <w:r>
+        <w:t xml:space="preserve">ervices. The API URI </w:t>
       </w:r>
       <w:r>
         <w:t xml:space="preserve">is </w:t>
@@ -511,13 +517,7 @@
               <w:fldChar w:fldCharType="separate"/>
             </w:r>
             <w:r>
-              <w:t>Respo</w:t>
-            </w:r>
-            <w:r>
-              <w:t>n</w:t>
-            </w:r>
-            <w:r>
-              <w:t>se Content</w:t>
+              <w:t>Response Content</w:t>
             </w:r>
             <w:r>
               <w:fldChar w:fldCharType="end"/>
@@ -9627,7 +9627,7 @@
       <w:r>
         <w:t>}</w:t>
       </w:r>
-      <w:bookmarkEnd w:id="0"/>
+      <w:bookmarkEnd w:id="1"/>
     </w:p>
     <w:sectPr>
       <w:headerReference w:type="even" r:id="rId11"/>
@@ -9691,7 +9691,7 @@
       <w:rPr>
         <w:noProof/>
       </w:rPr>
-      <w:pict w14:anchorId="7C037889">
+      <w:pict w14:anchorId="3A54A97B">
         <v:rect id="_x0000_i1026" alt="" style="width:.15pt;height:.05pt;mso-width-percent:0;mso-height-percent:0;mso-position-horizontal-relative:page;mso-position-vertical-relative:page;mso-width-percent:0;mso-height-percent:0" o:hrpct="1" o:hralign="center" o:hrstd="t" o:hr="t" fillcolor="#aca899" stroked="f"/>
       </w:pict>
     </w:r>
@@ -9699,7 +9699,7 @@
       <w:rPr>
         <w:noProof/>
       </w:rPr>
-      <w:pict w14:anchorId="311F5D97">
+      <w:pict w14:anchorId="61D008F9">
         <v:rect id="_x0000_i1025" alt="" style="width:.15pt;height:.05pt;mso-width-percent:0;mso-height-percent:0;mso-position-horizontal-relative:page;mso-position-vertical-relative:page;mso-width-percent:0;mso-height-percent:0" o:hrpct="1" o:hralign="center" o:hrstd="t" o:hr="t" fillcolor="#aca899" stroked="f"/>
       </w:pict>
     </w:r>
@@ -10043,7 +10043,7 @@
             </wp:anchor>
           </w:drawing>
         </mc:Choice>
-        <mc:Fallback xmlns:arto="http://schemas.microsoft.com/office/word/2006/arto" xmlns:a="http://schemas.openxmlformats.org/drawingml/2006/main">
+        <mc:Fallback xmlns:a="http://schemas.openxmlformats.org/drawingml/2006/main" xmlns:arto="http://schemas.microsoft.com/office/word/2006/arto">
           <w:pict w14:anchorId="7CACC3AF">
             <v:line id="Straight Connector 20" style="position:absolute;flip:y;z-index:251658242;visibility:visible;mso-wrap-style:square;mso-width-percent:0;mso-height-percent:0;mso-wrap-distance-left:9pt;mso-wrap-distance-top:0;mso-wrap-distance-right:9pt;mso-wrap-distance-bottom:0;mso-position-horizontal:left;mso-position-horizontal-relative:margin;mso-position-vertical:absolute;mso-position-vertical-relative:text;mso-width-percent:0;mso-height-percent:0;mso-width-relative:margin;mso-height-relative:margin" o:spid="_x0000_s1026" strokecolor="#97ca3d" strokeweight="1.5pt" from="0,12.2pt" to="549.75pt,12.25pt" w14:anchorId="400D9C81" o:gfxdata="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">
               <v:stroke joinstyle="miter"/>
@@ -10572,7 +10572,7 @@
       <w:rPr>
         <w:noProof/>
       </w:rPr>
-      <w:pict w14:anchorId="2E5A7CF0">
+      <w:pict w14:anchorId="60755680">
         <v:rect id="_x0000_i1028" alt="" style="width:436.15pt;height:.05pt;flip:y;mso-width-percent:0;mso-height-percent:0;mso-position-horizontal-relative:page;mso-position-vertical-relative:page;mso-width-percent:0;mso-height-percent:0" o:hrpct="989" o:hralign="center" o:hrstd="t" o:hr="t" fillcolor="#aca899" stroked="f"/>
       </w:pict>
     </w:r>
@@ -10580,7 +10580,7 @@
       <w:rPr>
         <w:noProof/>
       </w:rPr>
-      <w:pict w14:anchorId="1E0DA1A1">
+      <w:pict w14:anchorId="79AF983D">
         <v:rect id="_x0000_i1027" alt="" style="width:436.15pt;height:.05pt;flip:y;mso-width-percent:0;mso-height-percent:0;mso-position-horizontal-relative:page;mso-position-vertical-relative:page;mso-width-percent:0;mso-height-percent:0" o:hrpct="989" o:hralign="center" o:hrstd="t" o:hr="t" fillcolor="#aca899" stroked="f"/>
       </w:pict>
     </w:r>
@@ -10735,7 +10735,7 @@
             </wp:anchor>
           </w:drawing>
         </mc:Choice>
-        <mc:Fallback xmlns:arto="http://schemas.microsoft.com/office/word/2006/arto" xmlns:a14="http://schemas.microsoft.com/office/drawing/2010/main" xmlns:pic="http://schemas.openxmlformats.org/drawingml/2006/picture" xmlns:a="http://schemas.openxmlformats.org/drawingml/2006/main">
+        <mc:Fallback xmlns:a="http://schemas.openxmlformats.org/drawingml/2006/main" xmlns:pic="http://schemas.openxmlformats.org/drawingml/2006/picture" xmlns:a14="http://schemas.microsoft.com/office/drawing/2010/main" xmlns:arto="http://schemas.microsoft.com/office/word/2006/arto">
           <w:pict w14:anchorId="5E88A7ED">
             <v:line id="Straight Connector 11" style="position:absolute;flip:y;z-index:251658241;visibility:visible;mso-wrap-style:square;mso-width-percent:0;mso-height-percent:0;mso-wrap-distance-left:9pt;mso-wrap-distance-top:0;mso-wrap-distance-right:9pt;mso-wrap-distance-bottom:0;mso-position-horizontal:absolute;mso-position-horizontal-relative:text;mso-position-vertical:absolute;mso-position-vertical-relative:text;mso-width-percent:0;mso-height-percent:0;mso-width-relative:margin;mso-height-relative:margin" o:spid="_x0000_s1026" strokecolor="#97ca3d" strokeweight="1.5pt" from="-48.75pt,6.8pt" to="501pt,6.85pt" w14:anchorId="6E45044E" o:gfxdata="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">
               <v:stroke joinstyle="miter"/>
@@ -10873,7 +10873,7 @@
             </wp:anchor>
           </w:drawing>
         </mc:Choice>
-        <mc:Fallback xmlns:arto="http://schemas.microsoft.com/office/word/2006/arto" xmlns:a14="http://schemas.microsoft.com/office/drawing/2010/main" xmlns:pic="http://schemas.openxmlformats.org/drawingml/2006/picture" xmlns:a="http://schemas.openxmlformats.org/drawingml/2006/main">
+        <mc:Fallback xmlns:a="http://schemas.openxmlformats.org/drawingml/2006/main" xmlns:pic="http://schemas.openxmlformats.org/drawingml/2006/picture" xmlns:a14="http://schemas.microsoft.com/office/drawing/2010/main" xmlns:arto="http://schemas.microsoft.com/office/word/2006/arto">
           <w:pict w14:anchorId="63D0BF4E">
             <v:line id="Straight Connector 13" style="position:absolute;flip:y;z-index:251658243;visibility:visible;mso-wrap-style:square;mso-width-percent:0;mso-height-percent:0;mso-wrap-distance-left:9pt;mso-wrap-distance-top:0;mso-wrap-distance-right:9pt;mso-wrap-distance-bottom:0;mso-position-horizontal:absolute;mso-position-horizontal-relative:text;mso-position-vertical:absolute;mso-position-vertical-relative:text;mso-width-percent:0;mso-height-percent:0;mso-width-relative:margin;mso-height-relative:margin" o:spid="_x0000_s1026" strokecolor="#97ca3d" strokeweight="1.5pt" from="-48.75pt,6.8pt" to="501pt,6.85pt" w14:anchorId="5A8A114E" o:gfxdata="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">
               <v:stroke joinstyle="miter"/>
@@ -19248,15 +19248,6 @@
 </file>
 
 <file path=customXml/item1.xml><?xml version="1.0" encoding="utf-8"?>
-<?mso-contentType ?>
-<FormTemplates xmlns="http://schemas.microsoft.com/sharepoint/v3/contenttype/forms">
-  <Display>DocumentLibraryForm</Display>
-  <Edit>DocumentLibraryForm</Edit>
-  <New>DocumentLibraryForm</New>
-</FormTemplates>
-</file>
-
-<file path=customXml/item2.xml><?xml version="1.0" encoding="utf-8"?>
 <p:properties xmlns:p="http://schemas.microsoft.com/office/2006/metadata/properties" xmlns:xsi="http://www.w3.org/2001/XMLSchema-instance" xmlns:pc="http://schemas.microsoft.com/office/infopath/2007/PartnerControls">
   <documentManagement>
     <Comments xmlns="5b5d4291-b839-4dc9-baf9-9f50b1c07261" xsi:nil="true"/>
@@ -19268,11 +19259,16 @@
 </p:properties>
 </file>
 
-<file path=customXml/item3.xml><?xml version="1.0" encoding="utf-8"?>
-<b:Sources xmlns:b="http://schemas.openxmlformats.org/officeDocument/2006/bibliography" xmlns="http://schemas.openxmlformats.org/officeDocument/2006/bibliography" SelectedStyle="\APA.XSL" StyleName="APA"/>
+<file path=customXml/item2.xml><?xml version="1.0" encoding="utf-8"?>
+<?mso-contentType ?>
+<FormTemplates xmlns="http://schemas.microsoft.com/sharepoint/v3/contenttype/forms">
+  <Display>DocumentLibraryForm</Display>
+  <Edit>DocumentLibraryForm</Edit>
+  <New>DocumentLibraryForm</New>
+</FormTemplates>
 </file>
 
-<file path=customXml/item4.xml><?xml version="1.0" encoding="utf-8"?>
+<file path=customXml/item3.xml><?xml version="1.0" encoding="utf-8"?>
 <ct:contentTypeSchema xmlns:ct="http://schemas.microsoft.com/office/2006/metadata/contentType" xmlns:ma="http://schemas.microsoft.com/office/2006/metadata/properties/metaAttributes" ct:_="" ma:_="" ma:contentTypeName="Document" ma:contentTypeID="0x01010012027CDEAE500049AFE7BC8CE98402CB" ma:contentTypeVersion="19" ma:contentTypeDescription="Create a new document." ma:contentTypeScope="" ma:versionID="d806495b819d79bdc0bd0429abc452a7">
   <xsd:schema xmlns:xsd="http://www.w3.org/2001/XMLSchema" xmlns:xs="http://www.w3.org/2001/XMLSchema" xmlns:p="http://schemas.microsoft.com/office/2006/metadata/properties" xmlns:ns2="5b5d4291-b839-4dc9-baf9-9f50b1c07261" xmlns:ns3="a7092831-7ff0-4d57-9d47-d5468d72fb7e" targetNamespace="http://schemas.microsoft.com/office/2006/metadata/properties" ma:root="true" ma:fieldsID="58fd0eb61e3ee38091aa8c5581656e58" ns2:_="" ns3:_="">
     <xsd:import namespace="5b5d4291-b839-4dc9-baf9-9f50b1c07261"/>
@@ -19529,15 +19525,11 @@
 </ct:contentTypeSchema>
 </file>
 
-<file path=customXml/itemProps1.xml><?xml version="1.0" encoding="utf-8"?>
-<ds:datastoreItem xmlns:ds="http://schemas.openxmlformats.org/officeDocument/2006/customXml" ds:itemID="{7FDFED5A-A5E3-4528-9508-4CB0988F454D}">
-  <ds:schemaRefs>
-    <ds:schemaRef ds:uri="http://schemas.microsoft.com/sharepoint/v3/contenttype/forms"/>
-  </ds:schemaRefs>
-</ds:datastoreItem>
+<file path=customXml/item4.xml><?xml version="1.0" encoding="utf-8"?>
+<b:Sources xmlns:b="http://schemas.openxmlformats.org/officeDocument/2006/bibliography" xmlns="http://schemas.openxmlformats.org/officeDocument/2006/bibliography" SelectedStyle="\APA.XSL" StyleName="APA"/>
 </file>
 
-<file path=customXml/itemProps2.xml><?xml version="1.0" encoding="utf-8"?>
+<file path=customXml/itemProps1.xml><?xml version="1.0" encoding="utf-8"?>
 <ds:datastoreItem xmlns:ds="http://schemas.openxmlformats.org/officeDocument/2006/customXml" ds:itemID="{E4BCD20E-9A43-43F7-9EFF-7E27577D629C}">
   <ds:schemaRefs>
     <ds:schemaRef ds:uri="http://schemas.microsoft.com/office/2006/metadata/properties"/>
@@ -19548,15 +19540,15 @@
 </ds:datastoreItem>
 </file>
 
-<file path=customXml/itemProps3.xml><?xml version="1.0" encoding="utf-8"?>
-<ds:datastoreItem xmlns:ds="http://schemas.openxmlformats.org/officeDocument/2006/customXml" ds:itemID="{F45932E2-49C7-4E07-847A-BFE5D10BCB9D}">
+<file path=customXml/itemProps2.xml><?xml version="1.0" encoding="utf-8"?>
+<ds:datastoreItem xmlns:ds="http://schemas.openxmlformats.org/officeDocument/2006/customXml" ds:itemID="{7FDFED5A-A5E3-4528-9508-4CB0988F454D}">
   <ds:schemaRefs>
-    <ds:schemaRef ds:uri="http://schemas.openxmlformats.org/officeDocument/2006/bibliography"/>
+    <ds:schemaRef ds:uri="http://schemas.microsoft.com/sharepoint/v3/contenttype/forms"/>
   </ds:schemaRefs>
 </ds:datastoreItem>
 </file>
 
-<file path=customXml/itemProps4.xml><?xml version="1.0" encoding="utf-8"?>
+<file path=customXml/itemProps3.xml><?xml version="1.0" encoding="utf-8"?>
 <ds:datastoreItem xmlns:ds="http://schemas.openxmlformats.org/officeDocument/2006/customXml" ds:itemID="{C5059025-C209-4523-BDBE-4835D532037C}">
   <ds:schemaRefs>
     <ds:schemaRef ds:uri="http://schemas.microsoft.com/office/2006/metadata/contentType"/>
@@ -19573,4 +19565,12 @@
     <ds:schemaRef ds:uri="http://schemas.microsoft.com/internal/obd"/>
   </ds:schemaRefs>
 </ds:datastoreItem>
+</file>
+
+<file path=customXml/itemProps4.xml><?xml version="1.0" encoding="utf-8"?>
+<ds:datastoreItem xmlns:ds="http://schemas.openxmlformats.org/officeDocument/2006/customXml" ds:itemID="{F45932E2-49C7-4E07-847A-BFE5D10BCB9D}">
+  <ds:schemaRefs>
+    <ds:schemaRef ds:uri="http://schemas.openxmlformats.org/officeDocument/2006/bibliography"/>
+  </ds:schemaRefs>
+</ds:datastoreItem>
 </file>
</xml_diff>